<commit_message>
Piece 9 Edited and Reorg
</commit_message>
<xml_diff>
--- a/Front Matter/Template/9_Front-Matter.docx
+++ b/Front Matter/Template/9_Front-Matter.docx
@@ -1573,7 +1573,27 @@
           <w:szCs w:val="24"/>
           <w:lang w:val="en-US"/>
         </w:rPr>
-        <w:t xml:space="preserve"> 比赛中获得二等奖，同年获得 Otto Ortmann曲奖。俊安的研究兴趣同样广泛且丰富，从Josquin 的香颂-经文歌、莫扎特的唐璜中的拉康女权主义，到南洋风的主题等。他目前的研究项目是使用荣格精神分析研发音乐分析范式。</w:t>
+        <w:t xml:space="preserve"> 比赛中获得二等奖，同年获得 Otto </w:t>
+      </w:r>
+      <w:proofErr w:type="spellStart"/>
+      <w:r>
+        <w:rPr>
+          <w:rFonts w:ascii="Noto Serif SC" w:eastAsia="Noto Serif SC" w:hAnsi="Noto Serif SC" w:cs="Noto Serif"/>
+          <w:sz w:val="24"/>
+          <w:szCs w:val="24"/>
+          <w:lang w:val="en-US"/>
+        </w:rPr>
+        <w:t>Ortmann</w:t>
+      </w:r>
+      <w:proofErr w:type="spellEnd"/>
+      <w:r>
+        <w:rPr>
+          <w:rFonts w:ascii="Noto Serif SC" w:eastAsia="Noto Serif SC" w:hAnsi="Noto Serif SC" w:cs="Noto Serif"/>
+          <w:sz w:val="24"/>
+          <w:szCs w:val="24"/>
+          <w:lang w:val="en-US"/>
+        </w:rPr>
+        <w:t>曲奖。俊安的研究兴趣同样广泛且丰富，从Josquin 的香颂-经文歌、莫扎特的唐璜中的拉康女权主义，到南洋风的主题等。他目前的研究项目是使用荣格精神分析研发音乐分析范式。</w:t>
       </w:r>
     </w:p>
     <w:p>
@@ -3117,54 +3137,74 @@
           <w:szCs w:val="24"/>
           <w:lang w:val="en-US"/>
         </w:rPr>
+        <w:t>2</w:t>
+      </w:r>
+      <w:r>
+        <w:rPr>
+          <w:rFonts w:ascii="Noto Serif SC" w:eastAsia="Noto Serif SC" w:hAnsi="Noto Serif SC" w:cs="Noto Serif"/>
+          <w:sz w:val="24"/>
+          <w:szCs w:val="24"/>
+          <w:lang w:val="en-US"/>
+        </w:rPr>
+        <w:t xml:space="preserve">低音管 </w:t>
+      </w:r>
+      <w:r>
+        <w:rPr>
+          <w:rFonts w:ascii="Noto Serif SC" w:eastAsia="Noto Serif SC" w:hAnsi="Noto Serif SC" w:cs="Noto Serif"/>
+          <w:sz w:val="24"/>
+          <w:szCs w:val="24"/>
+          <w:lang w:val="en-US"/>
+        </w:rPr>
         <w:t xml:space="preserve">2 </w:t>
       </w:r>
-      <w:r>
-        <w:rPr>
-          <w:rFonts w:ascii="Noto Serif SC" w:eastAsia="Noto Serif SC" w:hAnsi="Noto Serif SC" w:cs="Noto Serif"/>
-          <w:sz w:val="24"/>
-          <w:szCs w:val="24"/>
-          <w:lang w:val="en-US"/>
-        </w:rPr>
-        <w:t xml:space="preserve">加键低音管 </w:t>
-      </w:r>
-      <w:r>
-        <w:rPr>
-          <w:rFonts w:ascii="Noto Serif SC" w:eastAsia="Noto Serif SC" w:hAnsi="Noto Serif SC" w:cs="Noto Serif"/>
-          <w:sz w:val="24"/>
-          <w:szCs w:val="24"/>
-          <w:lang w:val="en-US"/>
-        </w:rPr>
-        <w:t xml:space="preserve">2 </w:t>
-      </w:r>
-      <w:r>
-        <w:rPr>
-          <w:rFonts w:ascii="Noto Serif SC" w:eastAsia="Noto Serif SC" w:hAnsi="Noto Serif SC" w:cs="Noto Serif"/>
-          <w:sz w:val="24"/>
-          <w:szCs w:val="24"/>
-          <w:lang w:val="en-US"/>
-        </w:rPr>
-        <w:t>Keyed</w:t>
-      </w:r>
-      <w:r>
-        <w:rPr>
-          <w:rFonts w:ascii="Noto Serif SC" w:eastAsia="Noto Serif SC" w:hAnsi="Noto Serif SC" w:cs="Noto Serif"/>
-          <w:sz w:val="24"/>
-          <w:szCs w:val="24"/>
-          <w:lang w:val="en-US"/>
-        </w:rPr>
-        <w:t xml:space="preserve"> Diyin Guan</w:t>
-      </w:r>
-    </w:p>
-    <w:p>
-      <w:pPr>
-        <w:rPr>
-          <w:rFonts w:ascii="Noto Serif SC" w:eastAsia="Noto Serif SC" w:hAnsi="Noto Serif SC" w:cs="Noto Serif"/>
-          <w:sz w:val="24"/>
-          <w:szCs w:val="24"/>
-          <w:lang w:val="en-US"/>
-        </w:rPr>
-      </w:pPr>
+      <w:proofErr w:type="spellStart"/>
+      <w:r>
+        <w:rPr>
+          <w:rFonts w:ascii="Noto Serif SC" w:eastAsia="Noto Serif SC" w:hAnsi="Noto Serif SC" w:cs="Noto Serif"/>
+          <w:sz w:val="24"/>
+          <w:szCs w:val="24"/>
+          <w:lang w:val="en-US"/>
+        </w:rPr>
+        <w:t>Diyin</w:t>
+      </w:r>
+      <w:proofErr w:type="spellEnd"/>
+      <w:r>
+        <w:rPr>
+          <w:rFonts w:ascii="Noto Serif SC" w:eastAsia="Noto Serif SC" w:hAnsi="Noto Serif SC" w:cs="Noto Serif"/>
+          <w:sz w:val="24"/>
+          <w:szCs w:val="24"/>
+          <w:lang w:val="en-US"/>
+        </w:rPr>
+        <w:t xml:space="preserve"> Guan</w:t>
+      </w:r>
+    </w:p>
+    <w:p>
+      <w:pPr>
+        <w:rPr>
+          <w:rFonts w:ascii="Noto Serif SC" w:eastAsia="Noto Serif SC" w:hAnsi="Noto Serif SC" w:cs="Noto Serif"/>
+          <w:sz w:val="24"/>
+          <w:szCs w:val="24"/>
+          <w:lang w:val="en-US"/>
+        </w:rPr>
+      </w:pPr>
+      <w:r>
+        <w:rPr>
+          <w:rFonts w:ascii="Noto Serif SC" w:eastAsia="Noto Serif SC" w:hAnsi="Noto Serif SC" w:cs="Noto Serif"/>
+          <w:sz w:val="24"/>
+          <w:szCs w:val="24"/>
+          <w:lang w:val="en-US"/>
+        </w:rPr>
+        <w:t>1</w:t>
+      </w:r>
+      <w:r>
+        <w:rPr>
+          <w:rFonts w:ascii="Noto Serif SC" w:eastAsia="Noto Serif SC" w:hAnsi="Noto Serif SC" w:cs="Noto Serif"/>
+          <w:sz w:val="24"/>
+          <w:szCs w:val="24"/>
+          <w:lang w:val="en-US"/>
+        </w:rPr>
+        <w:t xml:space="preserve">倍低音管 </w:t>
+      </w:r>
       <w:r>
         <w:rPr>
           <w:rFonts w:ascii="Noto Serif SC" w:eastAsia="Noto Serif SC" w:hAnsi="Noto Serif SC" w:cs="Noto Serif"/>
@@ -3173,42 +3213,6 @@
           <w:lang w:val="en-US"/>
         </w:rPr>
         <w:t xml:space="preserve">1 </w:t>
-      </w:r>
-      <w:r>
-        <w:rPr>
-          <w:rFonts w:ascii="Noto Serif SC" w:eastAsia="Noto Serif SC" w:hAnsi="Noto Serif SC" w:cs="Noto Serif"/>
-          <w:sz w:val="24"/>
-          <w:szCs w:val="24"/>
-          <w:lang w:val="en-US"/>
-        </w:rPr>
-        <w:t xml:space="preserve">加键倍低音管 </w:t>
-      </w:r>
-      <w:r>
-        <w:rPr>
-          <w:rFonts w:ascii="Noto Serif SC" w:eastAsia="Noto Serif SC" w:hAnsi="Noto Serif SC" w:cs="Noto Serif"/>
-          <w:sz w:val="24"/>
-          <w:szCs w:val="24"/>
-          <w:lang w:val="en-US"/>
-        </w:rPr>
-        <w:t xml:space="preserve">1 </w:t>
-      </w:r>
-      <w:r>
-        <w:rPr>
-          <w:rFonts w:ascii="Noto Serif SC" w:eastAsia="Noto Serif SC" w:hAnsi="Noto Serif SC" w:cs="Noto Serif"/>
-          <w:sz w:val="24"/>
-          <w:szCs w:val="24"/>
-          <w:lang w:val="en-US"/>
-        </w:rPr>
-        <w:t>Keyed</w:t>
-      </w:r>
-      <w:r>
-        <w:rPr>
-          <w:rFonts w:ascii="Noto Serif SC" w:eastAsia="Noto Serif SC" w:hAnsi="Noto Serif SC" w:cs="Noto Serif"/>
-          <w:sz w:val="24"/>
-          <w:szCs w:val="24"/>
-          <w:lang w:val="en-US"/>
-        </w:rPr>
-        <w:t xml:space="preserve"> </w:t>
       </w:r>
       <w:proofErr w:type="spellStart"/>
       <w:r>

</xml_diff>